<commit_message>
Memperbaiki tata letak template SPT agar bagian VI dan VII tidak terpisah halaman
</commit_message>
<xml_diff>
--- a/resources/documents/Template_SPT_Dasar_Regulasi.docx
+++ b/resources/documents/Template_SPT_Dasar_Regulasi.docx
@@ -1764,7 +1764,7 @@
         </w:tblPrEx>
         <w:trPr>
           <w:cantSplit/>
-          <w:trHeight w:val="2750" w:hRule="atLeast"/>
+          <w:trHeight w:val="2550" w:hRule="atLeast"/>
         </w:trPr>
         <w:tc>
           <w:tcPr>
@@ -2356,7 +2356,7 @@
         </w:tblPrEx>
         <w:trPr>
           <w:cantSplit/>
-          <w:trHeight w:val="2400" w:hRule="atLeast"/>
+          <w:trHeight w:val="1800" w:hRule="atLeast"/>
         </w:trPr>
         <w:tc>
           <w:tcPr>
@@ -2794,7 +2794,7 @@
               <w:pStyle w:val="TableParagraph"/>
               <w:keepNext/>
               <w:keepLines/>
-              <w:spacing w:before="211"/>
+              <w:spacing w:before="100"/>
               <w:rPr>
                 <w:sz w:val="20"/>
               </w:rPr>
@@ -2870,7 +2870,7 @@
         </w:tblPrEx>
         <w:trPr>
           <w:cantSplit/>
-          <w:trHeight w:val="2550" w:hRule="atLeast"/>
+          <w:trHeight w:val="2350" w:hRule="atLeast"/>
         </w:trPr>
         <w:tc>
           <w:tcPr>
@@ -3058,7 +3058,7 @@
               <w:pStyle w:val="TableParagraph"/>
               <w:keepNext/>
               <w:keepLines/>
-              <w:spacing w:before="171"/>
+              <w:spacing w:before="100"/>
               <w:rPr>
                 <w:sz w:val="20"/>
               </w:rPr>
@@ -3395,7 +3395,7 @@
         </w:tblPrEx>
         <w:trPr>
           <w:cantSplit/>
-          <w:trHeight w:val="2450" w:hRule="atLeast"/>
+          <w:trHeight w:val="2250" w:hRule="atLeast"/>
         </w:trPr>
         <w:tc>
           <w:tcPr>
@@ -3924,7 +3924,7 @@
         </w:tblPrEx>
         <w:trPr>
           <w:cantSplit/>
-          <w:trHeight w:val="3070" w:hRule="atLeast"/>
+          <w:trHeight w:val="2900" w:hRule="atLeast"/>
         </w:trPr>
         <w:tc>
           <w:tcPr>
@@ -4124,7 +4124,7 @@
               <w:pStyle w:val="TableParagraph"/>
               <w:keepNext/>
               <w:keepLines/>
-              <w:spacing w:before="228"/>
+              <w:spacing w:before="100"/>
               <w:rPr>
                 <w:sz w:val="20"/>
               </w:rPr>
@@ -4330,7 +4330,7 @@
               <w:pStyle w:val="TableParagraph"/>
               <w:keepNext/>
               <w:keepLines/>
-              <w:spacing w:before="229"/>
+              <w:spacing w:before="100"/>
               <w:ind w:left="114" w:right="117"/>
               <w:jc w:val="center"/>
               <w:rPr>

</xml_diff>